<commit_message>
- added Manual for calibration - created a define for the CPU frequency - added the modificated HX711.h library (slown down the comunication for Long cables) - added precompiled file.
</commit_message>
<xml_diff>
--- a/sender/manual calibration.docx
+++ b/sender/manual calibration.docx
@@ -41,6 +41,38 @@
         <w:rPr>
           <w:lang w:val="en-GB"/>
         </w:rPr>
+        <w:t xml:space="preserve">Connect your mobile phone to the </w:t>
+      </w:r>
+      <w:proofErr w:type="spellStart"/>
+      <w:r>
+        <w:rPr>
+          <w:lang w:val="en-GB"/>
+        </w:rPr>
+        <w:t>Meshtastic</w:t>
+      </w:r>
+      <w:proofErr w:type="spellEnd"/>
+      <w:r>
+        <w:rPr>
+          <w:lang w:val="en-GB"/>
+        </w:rPr>
+        <w:t xml:space="preserve"> node of the transmitter and change the Lora setup to “SHORT_FAST”. So, you don’t spoil the database with uncalibrated data.</w:t>
+      </w:r>
+    </w:p>
+    <w:p>
+      <w:pPr>
+        <w:pStyle w:val="Listenabsatz"/>
+        <w:numPr>
+          <w:ilvl w:val="0"/>
+          <w:numId w:val="1"/>
+        </w:numPr>
+        <w:rPr>
+          <w:lang w:val="en-GB"/>
+        </w:rPr>
+      </w:pPr>
+      <w:r>
+        <w:rPr>
+          <w:lang w:val="en-GB"/>
+        </w:rPr>
         <w:t xml:space="preserve">Connect your mobile phone to a portable </w:t>
       </w:r>
       <w:proofErr w:type="spellStart"/>
@@ -57,6 +89,26 @@
         </w:rPr>
         <w:t xml:space="preserve"> node with the APE channel</w:t>
       </w:r>
+      <w:r>
+        <w:rPr>
+          <w:lang w:val="en-GB"/>
+        </w:rPr>
+        <w:t xml:space="preserve"> and change the Lora </w:t>
+      </w:r>
+      <w:proofErr w:type="spellStart"/>
+      <w:r>
+        <w:rPr>
+          <w:lang w:val="en-GB"/>
+        </w:rPr>
+        <w:t>setupt</w:t>
+      </w:r>
+      <w:proofErr w:type="spellEnd"/>
+      <w:r>
+        <w:rPr>
+          <w:lang w:val="en-GB"/>
+        </w:rPr>
+        <w:t xml:space="preserve"> to “SHORT_FAST”</w:t>
+      </w:r>
     </w:p>
     <w:p>
       <w:pPr>
@@ -202,77 +254,7 @@
           <w:lang w:val="en-GB"/>
         </w:rPr>
         <w:br/>
-        <w:t>{“</w:t>
-      </w:r>
-      <w:proofErr w:type="gramStart"/>
-      <w:r>
-        <w:rPr>
-          <w:lang w:val="en-GB"/>
-        </w:rPr>
-        <w:t>sensor”:&lt;</w:t>
-      </w:r>
-      <w:proofErr w:type="gramEnd"/>
-      <w:r>
-        <w:rPr>
-          <w:lang w:val="en-GB"/>
-        </w:rPr>
-        <w:t>x&gt;</w:t>
-      </w:r>
-      <w:proofErr w:type="gramStart"/>
-      <w:r>
-        <w:rPr>
-          <w:lang w:val="en-GB"/>
-        </w:rPr>
-        <w:t>,”sensDHT</w:t>
-      </w:r>
-      <w:proofErr w:type="gramEnd"/>
-      <w:r>
-        <w:rPr>
-          <w:lang w:val="en-GB"/>
-        </w:rPr>
-        <w:t>22</w:t>
-      </w:r>
-      <w:proofErr w:type="gramStart"/>
-      <w:r>
-        <w:rPr>
-          <w:lang w:val="en-GB"/>
-        </w:rPr>
-        <w:t>”:true,”sensHX</w:t>
-      </w:r>
-      <w:proofErr w:type="gramEnd"/>
-      <w:r>
-        <w:rPr>
-          <w:lang w:val="en-GB"/>
-        </w:rPr>
-        <w:t>711</w:t>
-      </w:r>
-      <w:proofErr w:type="gramStart"/>
-      <w:r>
-        <w:rPr>
-          <w:lang w:val="en-GB"/>
-        </w:rPr>
-        <w:t>”:true,”offset</w:t>
-      </w:r>
-      <w:proofErr w:type="gramEnd"/>
-      <w:r>
-        <w:rPr>
-          <w:lang w:val="en-GB"/>
-        </w:rPr>
-        <w:t>”:0</w:t>
-      </w:r>
-      <w:proofErr w:type="gramStart"/>
-      <w:r>
-        <w:rPr>
-          <w:lang w:val="en-GB"/>
-        </w:rPr>
-        <w:t>,”factor</w:t>
-      </w:r>
-      <w:proofErr w:type="gramEnd"/>
-      <w:r>
-        <w:rPr>
-          <w:lang w:val="en-GB"/>
-        </w:rPr>
-        <w:t>”:1}</w:t>
+        <w:t>{“sensor”:&lt;x&gt;,”sensDHT22”:true,”sensHX711”:true,”offset”:0,”factor”:1}</w:t>
       </w:r>
       <w:r>
         <w:rPr>
@@ -412,6 +394,24 @@
         <w:rPr>
           <w:lang w:val="en-GB"/>
         </w:rPr>
+        <w:t>Wait about 15 seconds until the transmitter changes to deep sleep mode.</w:t>
+      </w:r>
+    </w:p>
+    <w:p>
+      <w:pPr>
+        <w:pStyle w:val="Listenabsatz"/>
+        <w:numPr>
+          <w:ilvl w:val="0"/>
+          <w:numId w:val="1"/>
+        </w:numPr>
+        <w:rPr>
+          <w:lang w:val="en-GB"/>
+        </w:rPr>
+      </w:pPr>
+      <w:r>
+        <w:rPr>
+          <w:lang w:val="en-GB"/>
+        </w:rPr>
         <w:t xml:space="preserve">Push the button again and connect to </w:t>
       </w:r>
       <w:proofErr w:type="spellStart"/>
@@ -584,13 +584,7 @@
         <w:rPr>
           <w:lang w:val="en-GB"/>
         </w:rPr>
-        <w:t>the result of the division</w:t>
-      </w:r>
-      <w:r>
-        <w:rPr>
-          <w:lang w:val="en-GB"/>
-        </w:rPr>
-        <w:t xml:space="preserve"> as the new</w:t>
+        <w:t>the result of the division as the new</w:t>
       </w:r>
       <w:r>
         <w:rPr>
@@ -627,6 +621,24 @@
           <w:lang w:val="en-GB"/>
         </w:rPr>
         <w:t>After “store” and “reset” it should give the real weight and the sensor is calibrated.</w:t>
+      </w:r>
+    </w:p>
+    <w:p>
+      <w:pPr>
+        <w:pStyle w:val="Listenabsatz"/>
+        <w:numPr>
+          <w:ilvl w:val="0"/>
+          <w:numId w:val="1"/>
+        </w:numPr>
+        <w:rPr>
+          <w:lang w:val="en-GB"/>
+        </w:rPr>
+      </w:pPr>
+      <w:r>
+        <w:rPr>
+          <w:lang w:val="en-GB"/>
+        </w:rPr>
+        <w:t>Change the Lora setup on the transmitter and you mobile node to “MEDIUM_FAST”</w:t>
       </w:r>
     </w:p>
     <w:p>

</xml_diff>